<commit_message>
updated data and lab doc
</commit_message>
<xml_diff>
--- a/Fall 2025/Controls Lab/Lab 2/Lab2.docx
+++ b/Fall 2025/Controls Lab/Lab 2/Lab2.docx
@@ -313,7 +313,15 @@
         <w:tab/>
       </w:r>
       <w:r>
-        <w:t xml:space="preserve">In this lab the motor flywheel system relates an input voltage to an output rotational velocity. Understanding how to relate a voltage to a velocity is how the system can be controlled.  </w:t>
+        <w:t xml:space="preserve">In this lab the motor flywheel system relates </w:t>
+      </w:r>
+      <w:proofErr w:type="gramStart"/>
+      <w:r>
+        <w:t>an input</w:t>
+      </w:r>
+      <w:proofErr w:type="gramEnd"/>
+      <w:r>
+        <w:t xml:space="preserve"> voltage to an output rotational velocity. Understanding how to relate a voltage to a velocity is how the system can be controlled.  </w:t>
       </w:r>
     </w:p>
     <w:p>
@@ -990,11 +998,19 @@
       <w:r>
         <w:t xml:space="preserve">This can be used to easily generate what the output will look like. </w:t>
       </w:r>
-      <w:r>
-        <w:rPr>
-          <w:color w:val="000000" w:themeColor="text1"/>
-        </w:rPr>
-        <w:t xml:space="preserve">In order to </w:t>
+      <w:proofErr w:type="gramStart"/>
+      <w:r>
+        <w:rPr>
+          <w:color w:val="000000" w:themeColor="text1"/>
+        </w:rPr>
+        <w:t>In order to</w:t>
+      </w:r>
+      <w:proofErr w:type="gramEnd"/>
+      <w:r>
+        <w:rPr>
+          <w:color w:val="000000" w:themeColor="text1"/>
+        </w:rPr>
+        <w:t xml:space="preserve"> </w:t>
       </w:r>
       <w:r>
         <w:rPr>
@@ -1433,7 +1449,21 @@
         <w:rPr>
           <w:color w:val="000000" w:themeColor="text1"/>
         </w:rPr>
-        <w:t>is much easier to compute the unknowns.</w:t>
+        <w:t xml:space="preserve">is much easier to compute the </w:t>
+      </w:r>
+      <w:proofErr w:type="gramStart"/>
+      <w:r>
+        <w:rPr>
+          <w:color w:val="000000" w:themeColor="text1"/>
+        </w:rPr>
+        <w:t>unknowns</w:t>
+      </w:r>
+      <w:proofErr w:type="gramEnd"/>
+      <w:r>
+        <w:rPr>
+          <w:color w:val="000000" w:themeColor="text1"/>
+        </w:rPr>
+        <w:t>.</w:t>
       </w:r>
       <w:r>
         <w:rPr>
@@ -1834,7 +1864,21 @@
         <w:rPr>
           <w:color w:val="000000" w:themeColor="text1"/>
         </w:rPr>
-        <w:t>Using control theory, controllers can provide an input signal into the system to achieve a desired output. The controller takes into account the error between the actual signal and the desired output to determine the input signal. Two types of controllers were used in this lab: Bang-Bang and PID.</w:t>
+        <w:t xml:space="preserve">Using control theory, controllers can provide an input signal into the system to achieve a desired output. The controller </w:t>
+      </w:r>
+      <w:proofErr w:type="gramStart"/>
+      <w:r>
+        <w:rPr>
+          <w:color w:val="000000" w:themeColor="text1"/>
+        </w:rPr>
+        <w:t>takes into account</w:t>
+      </w:r>
+      <w:proofErr w:type="gramEnd"/>
+      <w:r>
+        <w:rPr>
+          <w:color w:val="000000" w:themeColor="text1"/>
+        </w:rPr>
+        <w:t xml:space="preserve"> the error between the actual signal and the desired output to determine the input signal. Two types of controllers were used in this lab: Bang-Bang and PID.</w:t>
       </w:r>
     </w:p>
     <w:p>
@@ -1884,7 +1928,35 @@
         <w:rPr>
           <w:color w:val="000000" w:themeColor="text1"/>
         </w:rPr>
-        <w:t xml:space="preserve"> The controller provides a fixed signal in the direction opposite of the error. The fixed signal is based on the effort level chosen for the controller. If the error is positive the controller will provide a positive signal until the error is no longer positive and vice versa. The deadband is implemented to prevent the controller from providing an input when the error is close to zero. When the error is within the designated deadband the controller will not provide an input. This prevents excessive oscillation and the performance of the bang-bang controller depends on the chosen effort level and deadband.</w:t>
+        <w:t xml:space="preserve"> The controller provides a fixed signal in the direction </w:t>
+      </w:r>
+      <w:proofErr w:type="gramStart"/>
+      <w:r>
+        <w:rPr>
+          <w:color w:val="000000" w:themeColor="text1"/>
+        </w:rPr>
+        <w:t>opposite of</w:t>
+      </w:r>
+      <w:proofErr w:type="gramEnd"/>
+      <w:r>
+        <w:rPr>
+          <w:color w:val="000000" w:themeColor="text1"/>
+        </w:rPr>
+        <w:t xml:space="preserve"> the error. The fixed signal is based on the effort level chosen for the controller. If the error is positive the controller will provide a positive signal until the error is no longer positive and vice versa. The deadband is implemented to prevent the controller from providing an input when the error is close to zero. When the error is within the designated deadband the controller will not provide an input. This prevents excessive </w:t>
+      </w:r>
+      <w:proofErr w:type="gramStart"/>
+      <w:r>
+        <w:rPr>
+          <w:color w:val="000000" w:themeColor="text1"/>
+        </w:rPr>
+        <w:t>oscillation</w:t>
+      </w:r>
+      <w:proofErr w:type="gramEnd"/>
+      <w:r>
+        <w:rPr>
+          <w:color w:val="000000" w:themeColor="text1"/>
+        </w:rPr>
+        <w:t xml:space="preserve"> and the performance of the bang-bang controller depends on the chosen effort level and deadband.</w:t>
       </w:r>
     </w:p>
     <w:p>
@@ -1935,7 +2007,21 @@
         <w:rPr>
           <w:color w:val="000000" w:themeColor="text1"/>
         </w:rPr>
-        <w:t>A PID (Proportional-Integral-Derivative) controller builds on the bang-bang controller by changing the input based on things like the magnitude and rate of change of the error. The proportional term works very similarly to the bang-bang controller but the magnitude of the input scales with the magnitude of the error. The integral term accumulates past error trends to eliminate long term bias. The derivative term attempts to predict future error using the rate of change of the error and attempts to counteract it. Tuning these three constants allows for a trade-off between speed, overshoot, and stability. These constants can be manually tuned as well as calculated from desired response parameters.</w:t>
+        <w:t xml:space="preserve">A PID (Proportional-Integral-Derivative) controller builds on the bang-bang controller by changing the input based on things like the magnitude and rate of change of the error. The proportional term works very similarly to the bang-bang controller but the magnitude of the input scales with the magnitude of the error. The integral term accumulates past error trends to eliminate long term bias. The derivative </w:t>
+      </w:r>
+      <w:proofErr w:type="gramStart"/>
+      <w:r>
+        <w:rPr>
+          <w:color w:val="000000" w:themeColor="text1"/>
+        </w:rPr>
+        <w:t>term</w:t>
+      </w:r>
+      <w:proofErr w:type="gramEnd"/>
+      <w:r>
+        <w:rPr>
+          <w:color w:val="000000" w:themeColor="text1"/>
+        </w:rPr>
+        <w:t xml:space="preserve"> attempts to predict future error using the rate of change of the error and attempts to counteract it. Tuning these three constants allows for a trade-off between speed, overshoot, and stability. These constants can be manually tuned as well as calculated from desired response parameters.</w:t>
       </w:r>
     </w:p>
     <w:p>
@@ -3170,7 +3256,35 @@
         <w:rPr>
           <w:color w:val="000000" w:themeColor="text1"/>
         </w:rPr>
-        <w:t xml:space="preserve">A custom LabVIEW VI was developed to implement controllers. The VI contains a signal generator that is capable of generating both square and sine wave signals at a desired amplitude and frequency.  The signal generator  serves as the desired angular position, which is compared to the measured angular position to create an error signal. This signal is fed into the controller to create a feedback loop. The controller can be </w:t>
+        <w:t xml:space="preserve">A custom LabVIEW VI was developed to implement controllers. The VI contains a signal generator that </w:t>
+      </w:r>
+      <w:proofErr w:type="gramStart"/>
+      <w:r>
+        <w:rPr>
+          <w:color w:val="000000" w:themeColor="text1"/>
+        </w:rPr>
+        <w:t>is capable of generating</w:t>
+      </w:r>
+      <w:proofErr w:type="gramEnd"/>
+      <w:r>
+        <w:rPr>
+          <w:color w:val="000000" w:themeColor="text1"/>
+        </w:rPr>
+        <w:t xml:space="preserve"> both square and sine wave signals at a desired amplitude and frequency.  The signal </w:t>
+      </w:r>
+      <w:proofErr w:type="gramStart"/>
+      <w:r>
+        <w:rPr>
+          <w:color w:val="000000" w:themeColor="text1"/>
+        </w:rPr>
+        <w:t>generator  serves</w:t>
+      </w:r>
+      <w:proofErr w:type="gramEnd"/>
+      <w:r>
+        <w:rPr>
+          <w:color w:val="000000" w:themeColor="text1"/>
+        </w:rPr>
+        <w:t xml:space="preserve"> as the desired angular position, which is compared to the measured angular position to create an error signal. This signal is fed into the controller to create a feedback loop. The controller can be </w:t>
       </w:r>
       <w:r>
         <w:rPr>
@@ -3198,7 +3312,21 @@
         <w:rPr>
           <w:color w:val="000000" w:themeColor="text1"/>
         </w:rPr>
-        <w:t>A Python analysis script was used to automatically process all collected data. The script reads each dataset, standardizes the column names, and computes the error between desired and measured position when applicable. For square-wave tests, the script detects step transitions and computes rise time, settling time, and percent overshoot from each transient response. For sine-wave tests, it calculates root-mean-square (RMS) error and command effort over each cycle. The script then summarizes these metrics into comparison tables for each controller and waveform type, enabling quantitative performance evaluation.</w:t>
+        <w:t xml:space="preserve">A Python analysis script was used to automatically process all collected data. The script reads each dataset, standardizes the column names, and computes the error between desired and measured position when applicable. For square-wave tests, the script detects step transitions and computes rise time, settling time, and </w:t>
+      </w:r>
+      <w:proofErr w:type="gramStart"/>
+      <w:r>
+        <w:rPr>
+          <w:color w:val="000000" w:themeColor="text1"/>
+        </w:rPr>
+        <w:t>percent</w:t>
+      </w:r>
+      <w:proofErr w:type="gramEnd"/>
+      <w:r>
+        <w:rPr>
+          <w:color w:val="000000" w:themeColor="text1"/>
+        </w:rPr>
+        <w:t xml:space="preserve"> overshoot from each transient response. For sine-wave tests, it calculates root-mean-square (RMS) error and command effort over each cycle. The script then summarizes these metrics into comparison tables for each controller and waveform type, enabling quantitative performance evaluation.</w:t>
       </w:r>
     </w:p>
     <w:p>
@@ -3249,7 +3377,21 @@
         <w:rPr>
           <w:color w:val="000000" w:themeColor="text1"/>
         </w:rPr>
-        <w:t>First, the desired amplitude was selected. This was done by adding 90 to the sum of the final four digits of your UFID. The turn on command was set to zero and the frequency was set to 0.25Hz. For this lab the amplitude was set to 99.</w:t>
+        <w:t xml:space="preserve">First, the desired amplitude was selected. This was done by adding 90 to the sum of the final four digits of your UFID. </w:t>
+      </w:r>
+      <w:proofErr w:type="gramStart"/>
+      <w:r>
+        <w:rPr>
+          <w:color w:val="000000" w:themeColor="text1"/>
+        </w:rPr>
+        <w:t>The turn on</w:t>
+      </w:r>
+      <w:proofErr w:type="gramEnd"/>
+      <w:r>
+        <w:rPr>
+          <w:color w:val="000000" w:themeColor="text1"/>
+        </w:rPr>
+        <w:t xml:space="preserve"> command was set to zero and the frequency was set to 0.25Hz. For this lab the amplitude was set to 99.</w:t>
       </w:r>
     </w:p>
     <w:p>
@@ -3313,13 +3455,90 @@
           <w:color w:val="000000" w:themeColor="text1"/>
         </w:rPr>
         <w:tab/>
-        <w:t>Last, the PID was tuned before it was implemented. This was done using two methods. The first was adjusting the values manually until the response looked good. This was done by increasing the proportional gain constant until the system had a fast response but not so much that it had significant overshoot. Then, the derivative controller was increased until the overshoot was reduced. Finally, the integral controller was</w:t>
-      </w:r>
-      <w:r>
-        <w:rPr>
-          <w:color w:val="000000" w:themeColor="text1"/>
-        </w:rPr>
-        <w:t xml:space="preserve"> increased until oscillation was reduced. The values for these constants were recorded and square wave data was recorded for about 4 cycles. The second method was calculating the desired gain constants for the proportional and derivative controllers using Ackermann’s method and running the square wave with those constants. The data was collected for about 4 cycles.</w:t>
+      </w:r>
+      <w:proofErr w:type="gramStart"/>
+      <w:r>
+        <w:rPr>
+          <w:color w:val="000000" w:themeColor="text1"/>
+        </w:rPr>
+        <w:t>Last</w:t>
+      </w:r>
+      <w:proofErr w:type="gramEnd"/>
+      <w:r>
+        <w:rPr>
+          <w:color w:val="000000" w:themeColor="text1"/>
+        </w:rPr>
+        <w:t xml:space="preserve">, the PID was tuned before it was implemented. This was done using two methods. The first was adjusting the values manually until the response looked good. This was done by increasing the proportional gain </w:t>
+      </w:r>
+      <w:proofErr w:type="gramStart"/>
+      <w:r>
+        <w:rPr>
+          <w:color w:val="000000" w:themeColor="text1"/>
+        </w:rPr>
+        <w:t>constant</w:t>
+      </w:r>
+      <w:proofErr w:type="gramEnd"/>
+      <w:r>
+        <w:rPr>
+          <w:color w:val="000000" w:themeColor="text1"/>
+        </w:rPr>
+        <w:t xml:space="preserve"> until the system had a fast response but not so much that it had significant overshoot. Then, the derivative controller was increased until the overshoot was reduced. Finally, the integral controller was</w:t>
+      </w:r>
+      <w:r>
+        <w:rPr>
+          <w:color w:val="000000" w:themeColor="text1"/>
+        </w:rPr>
+        <w:t xml:space="preserve"> increased until oscillation was reduced. The values for these constants were recorded and </w:t>
+      </w:r>
+      <w:r>
+        <w:rPr>
+          <w:color w:val="000000" w:themeColor="text1"/>
+        </w:rPr>
+        <w:t xml:space="preserve">both </w:t>
+      </w:r>
+      <w:r>
+        <w:rPr>
+          <w:color w:val="000000" w:themeColor="text1"/>
+        </w:rPr>
+        <w:t xml:space="preserve">square </w:t>
+      </w:r>
+      <w:r>
+        <w:rPr>
+          <w:color w:val="000000" w:themeColor="text1"/>
+        </w:rPr>
+        <w:t xml:space="preserve">and sine </w:t>
+      </w:r>
+      <w:r>
+        <w:rPr>
+          <w:color w:val="000000" w:themeColor="text1"/>
+        </w:rPr>
+        <w:t xml:space="preserve">wave data </w:t>
+      </w:r>
+      <w:proofErr w:type="gramStart"/>
+      <w:r>
+        <w:rPr>
+          <w:color w:val="000000" w:themeColor="text1"/>
+        </w:rPr>
+        <w:t>was</w:t>
+      </w:r>
+      <w:proofErr w:type="gramEnd"/>
+      <w:r>
+        <w:rPr>
+          <w:color w:val="000000" w:themeColor="text1"/>
+        </w:rPr>
+        <w:t xml:space="preserve"> recorded for about 4 cycles</w:t>
+      </w:r>
+      <w:r>
+        <w:rPr>
+          <w:color w:val="000000" w:themeColor="text1"/>
+        </w:rPr>
+        <w:t xml:space="preserve"> each</w:t>
+      </w:r>
+      <w:r>
+        <w:rPr>
+          <w:color w:val="000000" w:themeColor="text1"/>
+        </w:rPr>
+        <w:t>. The second method was calculating the desired gain constants for the proportional and derivative controllers using Ackermann’s method and running the square wave with those constants. The data was collected for about 4 cycles.</w:t>
       </w:r>
       <w:r>
         <w:rPr>
@@ -3390,13 +3609,41 @@
         <w:rPr>
           <w:color w:val="000000" w:themeColor="text1"/>
         </w:rPr>
-        <w:t xml:space="preserve"> ,</w:t>
-      </w:r>
-      <w:r>
-        <w:rPr>
-          <w:color w:val="000000" w:themeColor="text1"/>
-        </w:rPr>
-        <w:t xml:space="preserve">The python analysis script parsed through the data and separated the data by controller and waveform type. For each trial the code computed the mean, standard deviation, and RMS for the error and command effort. The code calculated the rise time, percent overshoot, and settling time for the square inputs. </w:t>
+        <w:t xml:space="preserve"> </w:t>
+      </w:r>
+      <w:proofErr w:type="gramStart"/>
+      <w:r>
+        <w:rPr>
+          <w:color w:val="000000" w:themeColor="text1"/>
+        </w:rPr>
+        <w:t>,</w:t>
+      </w:r>
+      <w:r>
+        <w:rPr>
+          <w:color w:val="000000" w:themeColor="text1"/>
+        </w:rPr>
+        <w:t>The</w:t>
+      </w:r>
+      <w:proofErr w:type="gramEnd"/>
+      <w:r>
+        <w:rPr>
+          <w:color w:val="000000" w:themeColor="text1"/>
+        </w:rPr>
+        <w:t xml:space="preserve"> python analysis script parsed through the data and separated the data by controller and waveform type. For each trial the code computed the mean, standard deviation, and RMS for the error and command effort. The code calculated the rise time, </w:t>
+      </w:r>
+      <w:proofErr w:type="gramStart"/>
+      <w:r>
+        <w:rPr>
+          <w:color w:val="000000" w:themeColor="text1"/>
+        </w:rPr>
+        <w:t>percent</w:t>
+      </w:r>
+      <w:proofErr w:type="gramEnd"/>
+      <w:r>
+        <w:rPr>
+          <w:color w:val="000000" w:themeColor="text1"/>
+        </w:rPr>
+        <w:t xml:space="preserve"> overshoot, and settling time for the square inputs. </w:t>
       </w:r>
     </w:p>
     <w:p>
@@ -3568,18 +3815,2140 @@
           <w:i/>
           <w:iCs/>
         </w:rPr>
-        <w:t>Step Response</w:t>
-      </w:r>
-    </w:p>
-    <w:p>
-      <w:pPr>
-        <w:jc w:val="both"/>
+        <w:t>Bang-Bang Response</w:t>
+      </w:r>
+    </w:p>
+    <w:p>
+      <w:pPr>
+        <w:rPr>
+          <w:color w:val="000000" w:themeColor="text1"/>
+        </w:rPr>
       </w:pPr>
       <w:r>
         <w:rPr>
           <w:i/>
           <w:iCs/>
         </w:rPr>
+        <w:tab/>
+      </w:r>
+      <w:r>
+        <w:t>For the bang-bang controller, both sine tracking and square wave responses were tested using different deadbands and duty cycles. The duty cycle was tested at 0.5 and 1.0 alongside the deadband being tested at 0, 5, and 10.</w:t>
+      </w:r>
+      <w:r>
+        <w:t xml:space="preserve"> Table I </w:t>
+      </w:r>
+      <w:r>
+        <w:t xml:space="preserve">shows the mean, standard deviation, </w:t>
+      </w:r>
+      <w:r>
+        <w:rPr>
+          <w:color w:val="EE0000"/>
+        </w:rPr>
+        <w:t>and root mean square</w:t>
+      </w:r>
+      <w:r>
+        <w:rPr>
+          <w:color w:val="EE0000"/>
+        </w:rPr>
+        <w:t xml:space="preserve"> </w:t>
+      </w:r>
+      <w:r>
+        <w:rPr>
+          <w:color w:val="000000" w:themeColor="text1"/>
+        </w:rPr>
+        <w:t>of the command signal for the sinusoidal bang-bang trials.</w:t>
+      </w:r>
+    </w:p>
+    <w:p>
+      <w:pPr>
+        <w:jc w:val="both"/>
+      </w:pPr>
+    </w:p>
+    <w:p>
+      <w:pPr>
+        <w:pStyle w:val="TableTitle"/>
+      </w:pPr>
+      <w:r>
+        <w:t>TABLE I</w:t>
+      </w:r>
+    </w:p>
+    <w:p>
+      <w:pPr>
+        <w:pStyle w:val="TableTitle"/>
+      </w:pPr>
+      <w:r>
+        <w:t>Bang-Bang Sinusoidal Command Signal Statistics</w:t>
+      </w:r>
+    </w:p>
+    <w:tbl>
+      <w:tblPr>
+        <w:tblW w:w="5040" w:type="dxa"/>
+        <w:tblInd w:w="90" w:type="dxa"/>
+        <w:tblBorders>
+          <w:top w:val="single" w:sz="12" w:space="0" w:color="808080"/>
+          <w:bottom w:val="single" w:sz="12" w:space="0" w:color="808080"/>
+        </w:tblBorders>
+        <w:tblLayout w:type="fixed"/>
+        <w:tblLook w:val="0000" w:firstRow="0" w:lastRow="0" w:firstColumn="0" w:lastColumn="0" w:noHBand="0" w:noVBand="0"/>
+      </w:tblPr>
+      <w:tblGrid>
+        <w:gridCol w:w="900"/>
+        <w:gridCol w:w="1080"/>
+        <w:gridCol w:w="810"/>
+        <w:gridCol w:w="1170"/>
+        <w:gridCol w:w="1080"/>
+      </w:tblGrid>
+      <w:tr>
+        <w:trPr>
+          <w:trHeight w:val="440"/>
+        </w:trPr>
+        <w:tc>
+          <w:tcPr>
+            <w:tcW w:w="900" w:type="dxa"/>
+            <w:tcBorders>
+              <w:top w:val="double" w:sz="6" w:space="0" w:color="auto"/>
+              <w:left w:val="nil"/>
+              <w:bottom w:val="single" w:sz="6" w:space="0" w:color="auto"/>
+              <w:right w:val="nil"/>
+            </w:tcBorders>
+            <w:vAlign w:val="center"/>
+          </w:tcPr>
+          <w:p>
+            <w:pPr>
+              <w:jc w:val="center"/>
+              <w:rPr>
+                <w:sz w:val="16"/>
+                <w:szCs w:val="16"/>
+              </w:rPr>
+            </w:pPr>
+            <w:r>
+              <w:rPr>
+                <w:sz w:val="16"/>
+                <w:szCs w:val="16"/>
+              </w:rPr>
+              <w:t>Deadband</w:t>
+            </w:r>
+          </w:p>
+        </w:tc>
+        <w:tc>
+          <w:tcPr>
+            <w:tcW w:w="1080" w:type="dxa"/>
+            <w:tcBorders>
+              <w:top w:val="double" w:sz="6" w:space="0" w:color="auto"/>
+              <w:left w:val="nil"/>
+              <w:bottom w:val="single" w:sz="6" w:space="0" w:color="auto"/>
+              <w:right w:val="nil"/>
+            </w:tcBorders>
+            <w:vAlign w:val="center"/>
+          </w:tcPr>
+          <w:p>
+            <w:pPr>
+              <w:pStyle w:val="TableTitle"/>
+              <w:rPr>
+                <w:smallCaps w:val="0"/>
+              </w:rPr>
+            </w:pPr>
+            <w:r>
+              <w:rPr>
+                <w:smallCaps w:val="0"/>
+              </w:rPr>
+              <w:t>Duty Cycle</w:t>
+            </w:r>
+          </w:p>
+        </w:tc>
+        <w:tc>
+          <w:tcPr>
+            <w:tcW w:w="810" w:type="dxa"/>
+            <w:tcBorders>
+              <w:top w:val="double" w:sz="4" w:space="0" w:color="auto"/>
+              <w:bottom w:val="single" w:sz="4" w:space="0" w:color="auto"/>
+            </w:tcBorders>
+            <w:vAlign w:val="center"/>
+          </w:tcPr>
+          <w:p>
+            <w:pPr>
+              <w:jc w:val="center"/>
+              <w:rPr>
+                <w:sz w:val="16"/>
+                <w:szCs w:val="16"/>
+              </w:rPr>
+            </w:pPr>
+            <w:r>
+              <w:rPr>
+                <w:sz w:val="16"/>
+                <w:szCs w:val="16"/>
+              </w:rPr>
+              <w:t>Mean</w:t>
+            </w:r>
+          </w:p>
+        </w:tc>
+        <w:tc>
+          <w:tcPr>
+            <w:tcW w:w="1170" w:type="dxa"/>
+            <w:tcBorders>
+              <w:top w:val="double" w:sz="6" w:space="0" w:color="auto"/>
+              <w:left w:val="nil"/>
+              <w:bottom w:val="single" w:sz="6" w:space="0" w:color="auto"/>
+              <w:right w:val="nil"/>
+            </w:tcBorders>
+            <w:vAlign w:val="center"/>
+          </w:tcPr>
+          <w:p>
+            <w:pPr>
+              <w:jc w:val="center"/>
+              <w:rPr>
+                <w:sz w:val="16"/>
+                <w:szCs w:val="16"/>
+              </w:rPr>
+            </w:pPr>
+            <w:r>
+              <w:rPr>
+                <w:sz w:val="16"/>
+                <w:szCs w:val="16"/>
+              </w:rPr>
+              <w:t>Standard Deviation</w:t>
+            </w:r>
+          </w:p>
+        </w:tc>
+        <w:tc>
+          <w:tcPr>
+            <w:tcW w:w="1080" w:type="dxa"/>
+            <w:tcBorders>
+              <w:top w:val="double" w:sz="4" w:space="0" w:color="auto"/>
+              <w:bottom w:val="single" w:sz="4" w:space="0" w:color="auto"/>
+            </w:tcBorders>
+            <w:vAlign w:val="center"/>
+          </w:tcPr>
+          <w:p>
+            <w:pPr>
+              <w:jc w:val="center"/>
+              <w:rPr>
+                <w:sz w:val="16"/>
+                <w:szCs w:val="16"/>
+              </w:rPr>
+            </w:pPr>
+            <w:r>
+              <w:rPr>
+                <w:sz w:val="16"/>
+                <w:szCs w:val="16"/>
+              </w:rPr>
+              <w:t>RMS</w:t>
+            </w:r>
+          </w:p>
+        </w:tc>
+      </w:tr>
+      <w:tr>
+        <w:tc>
+          <w:tcPr>
+            <w:tcW w:w="900" w:type="dxa"/>
+            <w:tcBorders>
+              <w:top w:val="nil"/>
+              <w:left w:val="nil"/>
+              <w:bottom w:val="nil"/>
+              <w:right w:val="nil"/>
+            </w:tcBorders>
+            <w:vAlign w:val="center"/>
+          </w:tcPr>
+          <w:p>
+            <w:pPr>
+              <w:jc w:val="center"/>
+              <w:rPr>
+                <w:sz w:val="16"/>
+                <w:szCs w:val="16"/>
+              </w:rPr>
+            </w:pPr>
+            <w:r>
+              <w:rPr>
+                <w:sz w:val="16"/>
+                <w:szCs w:val="16"/>
+              </w:rPr>
+              <w:t>0</w:t>
+            </w:r>
+          </w:p>
+        </w:tc>
+        <w:tc>
+          <w:tcPr>
+            <w:tcW w:w="1080" w:type="dxa"/>
+            <w:tcBorders>
+              <w:top w:val="nil"/>
+              <w:left w:val="nil"/>
+              <w:bottom w:val="nil"/>
+              <w:right w:val="nil"/>
+            </w:tcBorders>
+            <w:vAlign w:val="center"/>
+          </w:tcPr>
+          <w:p>
+            <w:pPr>
+              <w:jc w:val="center"/>
+              <w:rPr>
+                <w:sz w:val="16"/>
+                <w:szCs w:val="16"/>
+              </w:rPr>
+            </w:pPr>
+            <w:r>
+              <w:rPr>
+                <w:sz w:val="16"/>
+                <w:szCs w:val="16"/>
+              </w:rPr>
+              <w:t>0.5</w:t>
+            </w:r>
+          </w:p>
+        </w:tc>
+        <w:tc>
+          <w:tcPr>
+            <w:tcW w:w="810" w:type="dxa"/>
+            <w:tcBorders>
+              <w:top w:val="single" w:sz="4" w:space="0" w:color="auto"/>
+            </w:tcBorders>
+            <w:vAlign w:val="center"/>
+          </w:tcPr>
+          <w:p>
+            <w:pPr>
+              <w:jc w:val="center"/>
+              <w:rPr>
+                <w:sz w:val="16"/>
+                <w:szCs w:val="16"/>
+              </w:rPr>
+            </w:pPr>
+            <w:r>
+              <w:rPr>
+                <w:sz w:val="16"/>
+                <w:szCs w:val="16"/>
+              </w:rPr>
+              <w:t>62.911</w:t>
+            </w:r>
+          </w:p>
+        </w:tc>
+        <w:tc>
+          <w:tcPr>
+            <w:tcW w:w="1170" w:type="dxa"/>
+            <w:tcBorders>
+              <w:top w:val="nil"/>
+              <w:left w:val="nil"/>
+              <w:bottom w:val="nil"/>
+              <w:right w:val="nil"/>
+            </w:tcBorders>
+            <w:vAlign w:val="center"/>
+          </w:tcPr>
+          <w:p>
+            <w:pPr>
+              <w:jc w:val="center"/>
+              <w:rPr>
+                <w:sz w:val="16"/>
+                <w:szCs w:val="16"/>
+              </w:rPr>
+            </w:pPr>
+            <w:r>
+              <w:rPr>
+                <w:sz w:val="16"/>
+                <w:szCs w:val="16"/>
+              </w:rPr>
+              <w:t>30.485</w:t>
+            </w:r>
+          </w:p>
+        </w:tc>
+        <w:tc>
+          <w:tcPr>
+            <w:tcW w:w="1080" w:type="dxa"/>
+            <w:tcBorders>
+              <w:top w:val="single" w:sz="4" w:space="0" w:color="auto"/>
+            </w:tcBorders>
+            <w:vAlign w:val="center"/>
+          </w:tcPr>
+          <w:p>
+            <w:pPr>
+              <w:jc w:val="center"/>
+              <w:rPr>
+                <w:sz w:val="16"/>
+                <w:szCs w:val="16"/>
+              </w:rPr>
+            </w:pPr>
+            <w:r>
+              <w:rPr>
+                <w:sz w:val="16"/>
+                <w:szCs w:val="16"/>
+              </w:rPr>
+              <w:t>69.906</w:t>
+            </w:r>
+          </w:p>
+        </w:tc>
+      </w:tr>
+      <w:tr>
+        <w:tc>
+          <w:tcPr>
+            <w:tcW w:w="900" w:type="dxa"/>
+            <w:tcBorders>
+              <w:top w:val="nil"/>
+              <w:left w:val="nil"/>
+              <w:bottom w:val="nil"/>
+              <w:right w:val="nil"/>
+            </w:tcBorders>
+            <w:vAlign w:val="center"/>
+          </w:tcPr>
+          <w:p>
+            <w:pPr>
+              <w:jc w:val="center"/>
+              <w:rPr>
+                <w:i/>
+                <w:iCs/>
+                <w:sz w:val="16"/>
+                <w:szCs w:val="16"/>
+              </w:rPr>
+            </w:pPr>
+            <w:r>
+              <w:rPr>
+                <w:i/>
+                <w:iCs/>
+                <w:sz w:val="16"/>
+                <w:szCs w:val="16"/>
+              </w:rPr>
+              <w:t>5</w:t>
+            </w:r>
+          </w:p>
+        </w:tc>
+        <w:tc>
+          <w:tcPr>
+            <w:tcW w:w="1080" w:type="dxa"/>
+            <w:tcBorders>
+              <w:top w:val="nil"/>
+              <w:left w:val="nil"/>
+              <w:bottom w:val="nil"/>
+              <w:right w:val="nil"/>
+            </w:tcBorders>
+            <w:vAlign w:val="center"/>
+          </w:tcPr>
+          <w:p>
+            <w:pPr>
+              <w:jc w:val="center"/>
+              <w:rPr>
+                <w:sz w:val="16"/>
+                <w:szCs w:val="16"/>
+              </w:rPr>
+            </w:pPr>
+            <w:r>
+              <w:rPr>
+                <w:sz w:val="16"/>
+                <w:szCs w:val="16"/>
+              </w:rPr>
+              <w:t>0.5</w:t>
+            </w:r>
+          </w:p>
+        </w:tc>
+        <w:tc>
+          <w:tcPr>
+            <w:tcW w:w="810" w:type="dxa"/>
+            <w:vAlign w:val="center"/>
+          </w:tcPr>
+          <w:p>
+            <w:pPr>
+              <w:jc w:val="center"/>
+              <w:rPr>
+                <w:sz w:val="16"/>
+                <w:szCs w:val="16"/>
+              </w:rPr>
+            </w:pPr>
+            <w:r>
+              <w:rPr>
+                <w:sz w:val="16"/>
+                <w:szCs w:val="16"/>
+              </w:rPr>
+              <w:t>63.022</w:t>
+            </w:r>
+          </w:p>
+        </w:tc>
+        <w:tc>
+          <w:tcPr>
+            <w:tcW w:w="1170" w:type="dxa"/>
+            <w:tcBorders>
+              <w:top w:val="nil"/>
+              <w:left w:val="nil"/>
+              <w:bottom w:val="nil"/>
+              <w:right w:val="nil"/>
+            </w:tcBorders>
+            <w:vAlign w:val="center"/>
+          </w:tcPr>
+          <w:p>
+            <w:pPr>
+              <w:jc w:val="center"/>
+              <w:rPr>
+                <w:sz w:val="16"/>
+                <w:szCs w:val="16"/>
+                <w:vertAlign w:val="superscript"/>
+              </w:rPr>
+            </w:pPr>
+            <w:r>
+              <w:rPr>
+                <w:sz w:val="16"/>
+                <w:szCs w:val="16"/>
+              </w:rPr>
+              <w:t>30.446</w:t>
+            </w:r>
+          </w:p>
+        </w:tc>
+        <w:tc>
+          <w:tcPr>
+            <w:tcW w:w="1080" w:type="dxa"/>
+            <w:vAlign w:val="center"/>
+          </w:tcPr>
+          <w:p>
+            <w:pPr>
+              <w:jc w:val="center"/>
+              <w:rPr>
+                <w:sz w:val="16"/>
+                <w:szCs w:val="16"/>
+              </w:rPr>
+            </w:pPr>
+            <w:r>
+              <w:rPr>
+                <w:sz w:val="16"/>
+                <w:szCs w:val="16"/>
+              </w:rPr>
+              <w:t>69.990</w:t>
+            </w:r>
+          </w:p>
+        </w:tc>
+      </w:tr>
+      <w:tr>
+        <w:tc>
+          <w:tcPr>
+            <w:tcW w:w="900" w:type="dxa"/>
+            <w:tcBorders>
+              <w:top w:val="nil"/>
+              <w:left w:val="nil"/>
+              <w:bottom w:val="nil"/>
+              <w:right w:val="nil"/>
+            </w:tcBorders>
+            <w:vAlign w:val="center"/>
+          </w:tcPr>
+          <w:p>
+            <w:pPr>
+              <w:jc w:val="center"/>
+              <w:rPr>
+                <w:i/>
+                <w:iCs/>
+                <w:sz w:val="16"/>
+                <w:szCs w:val="16"/>
+              </w:rPr>
+            </w:pPr>
+            <w:r>
+              <w:rPr>
+                <w:i/>
+                <w:iCs/>
+                <w:sz w:val="16"/>
+                <w:szCs w:val="16"/>
+              </w:rPr>
+              <w:t>10</w:t>
+            </w:r>
+          </w:p>
+        </w:tc>
+        <w:tc>
+          <w:tcPr>
+            <w:tcW w:w="1080" w:type="dxa"/>
+            <w:tcBorders>
+              <w:top w:val="nil"/>
+              <w:left w:val="nil"/>
+              <w:bottom w:val="nil"/>
+              <w:right w:val="nil"/>
+            </w:tcBorders>
+            <w:vAlign w:val="center"/>
+          </w:tcPr>
+          <w:p>
+            <w:pPr>
+              <w:jc w:val="center"/>
+              <w:rPr>
+                <w:sz w:val="16"/>
+                <w:szCs w:val="16"/>
+              </w:rPr>
+            </w:pPr>
+            <w:r>
+              <w:rPr>
+                <w:sz w:val="16"/>
+                <w:szCs w:val="16"/>
+              </w:rPr>
+              <w:t>0.5</w:t>
+            </w:r>
+          </w:p>
+        </w:tc>
+        <w:tc>
+          <w:tcPr>
+            <w:tcW w:w="810" w:type="dxa"/>
+            <w:vAlign w:val="center"/>
+          </w:tcPr>
+          <w:p>
+            <w:pPr>
+              <w:jc w:val="center"/>
+              <w:rPr>
+                <w:sz w:val="16"/>
+                <w:szCs w:val="16"/>
+              </w:rPr>
+            </w:pPr>
+            <w:r>
+              <w:rPr>
+                <w:sz w:val="16"/>
+                <w:szCs w:val="16"/>
+              </w:rPr>
+              <w:t>63.012</w:t>
+            </w:r>
+          </w:p>
+        </w:tc>
+        <w:tc>
+          <w:tcPr>
+            <w:tcW w:w="1170" w:type="dxa"/>
+            <w:tcBorders>
+              <w:top w:val="nil"/>
+              <w:left w:val="nil"/>
+              <w:bottom w:val="nil"/>
+              <w:right w:val="nil"/>
+            </w:tcBorders>
+            <w:vAlign w:val="center"/>
+          </w:tcPr>
+          <w:p>
+            <w:pPr>
+              <w:jc w:val="center"/>
+              <w:rPr>
+                <w:sz w:val="16"/>
+                <w:szCs w:val="16"/>
+              </w:rPr>
+            </w:pPr>
+            <w:r>
+              <w:rPr>
+                <w:sz w:val="16"/>
+                <w:szCs w:val="16"/>
+              </w:rPr>
+              <w:t>30.420</w:t>
+            </w:r>
+          </w:p>
+        </w:tc>
+        <w:tc>
+          <w:tcPr>
+            <w:tcW w:w="1080" w:type="dxa"/>
+            <w:vAlign w:val="center"/>
+          </w:tcPr>
+          <w:p>
+            <w:pPr>
+              <w:jc w:val="center"/>
+              <w:rPr>
+                <w:sz w:val="16"/>
+                <w:szCs w:val="16"/>
+              </w:rPr>
+            </w:pPr>
+            <w:r>
+              <w:rPr>
+                <w:sz w:val="16"/>
+                <w:szCs w:val="16"/>
+              </w:rPr>
+              <w:t>69.969</w:t>
+            </w:r>
+          </w:p>
+        </w:tc>
+      </w:tr>
+      <w:tr>
+        <w:tc>
+          <w:tcPr>
+            <w:tcW w:w="900" w:type="dxa"/>
+            <w:tcBorders>
+              <w:top w:val="nil"/>
+              <w:left w:val="nil"/>
+              <w:bottom w:val="nil"/>
+              <w:right w:val="nil"/>
+            </w:tcBorders>
+            <w:vAlign w:val="center"/>
+          </w:tcPr>
+          <w:p>
+            <w:pPr>
+              <w:jc w:val="center"/>
+              <w:rPr>
+                <w:i/>
+                <w:iCs/>
+                <w:sz w:val="16"/>
+                <w:szCs w:val="16"/>
+              </w:rPr>
+            </w:pPr>
+            <w:r>
+              <w:rPr>
+                <w:sz w:val="16"/>
+                <w:szCs w:val="16"/>
+              </w:rPr>
+              <w:t>0</w:t>
+            </w:r>
+          </w:p>
+        </w:tc>
+        <w:tc>
+          <w:tcPr>
+            <w:tcW w:w="1080" w:type="dxa"/>
+            <w:tcBorders>
+              <w:top w:val="nil"/>
+              <w:left w:val="nil"/>
+              <w:bottom w:val="nil"/>
+              <w:right w:val="nil"/>
+            </w:tcBorders>
+            <w:vAlign w:val="center"/>
+          </w:tcPr>
+          <w:p>
+            <w:pPr>
+              <w:jc w:val="center"/>
+              <w:rPr>
+                <w:sz w:val="16"/>
+                <w:szCs w:val="16"/>
+                <w:vertAlign w:val="superscript"/>
+              </w:rPr>
+            </w:pPr>
+            <w:r>
+              <w:rPr>
+                <w:sz w:val="16"/>
+                <w:szCs w:val="16"/>
+              </w:rPr>
+              <w:t>1.</w:t>
+            </w:r>
+            <w:r>
+              <w:rPr>
+                <w:sz w:val="16"/>
+                <w:szCs w:val="16"/>
+              </w:rPr>
+              <w:t>0</w:t>
+            </w:r>
+          </w:p>
+        </w:tc>
+        <w:tc>
+          <w:tcPr>
+            <w:tcW w:w="810" w:type="dxa"/>
+            <w:vAlign w:val="center"/>
+          </w:tcPr>
+          <w:p>
+            <w:pPr>
+              <w:jc w:val="center"/>
+              <w:rPr>
+                <w:sz w:val="16"/>
+                <w:szCs w:val="16"/>
+              </w:rPr>
+            </w:pPr>
+            <w:r>
+              <w:rPr>
+                <w:sz w:val="16"/>
+                <w:szCs w:val="16"/>
+              </w:rPr>
+              <w:t>63.045</w:t>
+            </w:r>
+          </w:p>
+        </w:tc>
+        <w:tc>
+          <w:tcPr>
+            <w:tcW w:w="1170" w:type="dxa"/>
+            <w:tcBorders>
+              <w:top w:val="nil"/>
+              <w:left w:val="nil"/>
+              <w:bottom w:val="nil"/>
+              <w:right w:val="nil"/>
+            </w:tcBorders>
+            <w:vAlign w:val="center"/>
+          </w:tcPr>
+          <w:p>
+            <w:pPr>
+              <w:jc w:val="center"/>
+              <w:rPr>
+                <w:sz w:val="16"/>
+                <w:szCs w:val="16"/>
+              </w:rPr>
+            </w:pPr>
+            <w:r>
+              <w:rPr>
+                <w:sz w:val="16"/>
+                <w:szCs w:val="16"/>
+              </w:rPr>
+              <w:t>30.461</w:t>
+            </w:r>
+          </w:p>
+        </w:tc>
+        <w:tc>
+          <w:tcPr>
+            <w:tcW w:w="1080" w:type="dxa"/>
+            <w:vAlign w:val="center"/>
+          </w:tcPr>
+          <w:p>
+            <w:pPr>
+              <w:jc w:val="center"/>
+              <w:rPr>
+                <w:sz w:val="16"/>
+                <w:szCs w:val="16"/>
+              </w:rPr>
+            </w:pPr>
+            <w:r>
+              <w:rPr>
+                <w:sz w:val="16"/>
+                <w:szCs w:val="16"/>
+              </w:rPr>
+              <w:t>70.017</w:t>
+            </w:r>
+          </w:p>
+        </w:tc>
+      </w:tr>
+      <w:tr>
+        <w:trPr>
+          <w:trHeight w:val="81"/>
+        </w:trPr>
+        <w:tc>
+          <w:tcPr>
+            <w:tcW w:w="900" w:type="dxa"/>
+            <w:tcBorders>
+              <w:top w:val="nil"/>
+              <w:left w:val="nil"/>
+              <w:bottom w:val="nil"/>
+              <w:right w:val="nil"/>
+            </w:tcBorders>
+            <w:vAlign w:val="center"/>
+          </w:tcPr>
+          <w:p>
+            <w:pPr>
+              <w:jc w:val="center"/>
+              <w:rPr>
+                <w:i/>
+                <w:iCs/>
+                <w:sz w:val="16"/>
+                <w:szCs w:val="16"/>
+              </w:rPr>
+            </w:pPr>
+            <w:r>
+              <w:rPr>
+                <w:i/>
+                <w:iCs/>
+                <w:sz w:val="16"/>
+                <w:szCs w:val="16"/>
+              </w:rPr>
+              <w:t>5</w:t>
+            </w:r>
+          </w:p>
+        </w:tc>
+        <w:tc>
+          <w:tcPr>
+            <w:tcW w:w="1080" w:type="dxa"/>
+            <w:tcBorders>
+              <w:top w:val="nil"/>
+              <w:left w:val="nil"/>
+              <w:bottom w:val="nil"/>
+              <w:right w:val="nil"/>
+            </w:tcBorders>
+            <w:vAlign w:val="center"/>
+          </w:tcPr>
+          <w:p>
+            <w:pPr>
+              <w:jc w:val="center"/>
+              <w:rPr>
+                <w:sz w:val="16"/>
+                <w:szCs w:val="16"/>
+              </w:rPr>
+            </w:pPr>
+            <w:r>
+              <w:rPr>
+                <w:sz w:val="16"/>
+                <w:szCs w:val="16"/>
+              </w:rPr>
+              <w:t>1.0</w:t>
+            </w:r>
+          </w:p>
+        </w:tc>
+        <w:tc>
+          <w:tcPr>
+            <w:tcW w:w="810" w:type="dxa"/>
+            <w:vAlign w:val="center"/>
+          </w:tcPr>
+          <w:p>
+            <w:pPr>
+              <w:jc w:val="center"/>
+              <w:rPr>
+                <w:sz w:val="16"/>
+                <w:szCs w:val="16"/>
+              </w:rPr>
+            </w:pPr>
+            <w:r>
+              <w:rPr>
+                <w:sz w:val="16"/>
+                <w:szCs w:val="16"/>
+              </w:rPr>
+              <w:t>62.913</w:t>
+            </w:r>
+          </w:p>
+        </w:tc>
+        <w:tc>
+          <w:tcPr>
+            <w:tcW w:w="1170" w:type="dxa"/>
+            <w:tcBorders>
+              <w:top w:val="nil"/>
+              <w:left w:val="nil"/>
+              <w:bottom w:val="nil"/>
+              <w:right w:val="nil"/>
+            </w:tcBorders>
+            <w:vAlign w:val="center"/>
+          </w:tcPr>
+          <w:p>
+            <w:pPr>
+              <w:jc w:val="center"/>
+              <w:rPr>
+                <w:sz w:val="16"/>
+                <w:szCs w:val="16"/>
+              </w:rPr>
+            </w:pPr>
+            <w:r>
+              <w:rPr>
+                <w:sz w:val="16"/>
+                <w:szCs w:val="16"/>
+              </w:rPr>
+              <w:t>30.505</w:t>
+            </w:r>
+          </w:p>
+        </w:tc>
+        <w:tc>
+          <w:tcPr>
+            <w:tcW w:w="1080" w:type="dxa"/>
+            <w:vAlign w:val="center"/>
+          </w:tcPr>
+          <w:p>
+            <w:pPr>
+              <w:jc w:val="center"/>
+              <w:rPr>
+                <w:sz w:val="16"/>
+                <w:szCs w:val="16"/>
+              </w:rPr>
+            </w:pPr>
+            <w:r>
+              <w:rPr>
+                <w:sz w:val="16"/>
+                <w:szCs w:val="16"/>
+              </w:rPr>
+              <w:t>69.917</w:t>
+            </w:r>
+          </w:p>
+        </w:tc>
+      </w:tr>
+      <w:tr>
+        <w:trPr>
+          <w:trHeight w:val="162"/>
+        </w:trPr>
+        <w:tc>
+          <w:tcPr>
+            <w:tcW w:w="900" w:type="dxa"/>
+            <w:tcBorders>
+              <w:top w:val="nil"/>
+              <w:left w:val="nil"/>
+              <w:bottom w:val="double" w:sz="6" w:space="0" w:color="auto"/>
+              <w:right w:val="nil"/>
+            </w:tcBorders>
+            <w:vAlign w:val="center"/>
+          </w:tcPr>
+          <w:p>
+            <w:pPr>
+              <w:jc w:val="center"/>
+              <w:rPr>
+                <w:i/>
+                <w:iCs/>
+                <w:sz w:val="16"/>
+                <w:szCs w:val="16"/>
+              </w:rPr>
+            </w:pPr>
+            <w:r>
+              <w:rPr>
+                <w:i/>
+                <w:iCs/>
+                <w:sz w:val="16"/>
+                <w:szCs w:val="16"/>
+              </w:rPr>
+              <w:t>10</w:t>
+            </w:r>
+          </w:p>
+        </w:tc>
+        <w:tc>
+          <w:tcPr>
+            <w:tcW w:w="1080" w:type="dxa"/>
+            <w:tcBorders>
+              <w:top w:val="nil"/>
+              <w:left w:val="nil"/>
+              <w:bottom w:val="double" w:sz="6" w:space="0" w:color="auto"/>
+              <w:right w:val="nil"/>
+            </w:tcBorders>
+            <w:vAlign w:val="center"/>
+          </w:tcPr>
+          <w:p>
+            <w:pPr>
+              <w:jc w:val="center"/>
+              <w:rPr>
+                <w:sz w:val="16"/>
+                <w:szCs w:val="16"/>
+              </w:rPr>
+            </w:pPr>
+            <w:r>
+              <w:rPr>
+                <w:sz w:val="16"/>
+                <w:szCs w:val="16"/>
+              </w:rPr>
+              <w:t>1.0</w:t>
+            </w:r>
+          </w:p>
+        </w:tc>
+        <w:tc>
+          <w:tcPr>
+            <w:tcW w:w="810" w:type="dxa"/>
+            <w:tcBorders>
+              <w:bottom w:val="double" w:sz="4" w:space="0" w:color="auto"/>
+            </w:tcBorders>
+            <w:vAlign w:val="center"/>
+          </w:tcPr>
+          <w:p>
+            <w:pPr>
+              <w:jc w:val="center"/>
+              <w:rPr>
+                <w:sz w:val="16"/>
+                <w:szCs w:val="16"/>
+              </w:rPr>
+            </w:pPr>
+            <w:r>
+              <w:rPr>
+                <w:sz w:val="16"/>
+                <w:szCs w:val="16"/>
+              </w:rPr>
+              <w:t>63.061</w:t>
+            </w:r>
+          </w:p>
+        </w:tc>
+        <w:tc>
+          <w:tcPr>
+            <w:tcW w:w="1170" w:type="dxa"/>
+            <w:tcBorders>
+              <w:top w:val="nil"/>
+              <w:left w:val="nil"/>
+              <w:bottom w:val="double" w:sz="6" w:space="0" w:color="auto"/>
+              <w:right w:val="nil"/>
+            </w:tcBorders>
+            <w:vAlign w:val="center"/>
+          </w:tcPr>
+          <w:p>
+            <w:pPr>
+              <w:jc w:val="center"/>
+              <w:rPr>
+                <w:sz w:val="16"/>
+                <w:szCs w:val="16"/>
+              </w:rPr>
+            </w:pPr>
+            <w:r>
+              <w:rPr>
+                <w:sz w:val="16"/>
+                <w:szCs w:val="16"/>
+              </w:rPr>
+              <w:t>30.497</w:t>
+            </w:r>
+          </w:p>
+        </w:tc>
+        <w:tc>
+          <w:tcPr>
+            <w:tcW w:w="1080" w:type="dxa"/>
+            <w:tcBorders>
+              <w:bottom w:val="double" w:sz="4" w:space="0" w:color="auto"/>
+            </w:tcBorders>
+            <w:vAlign w:val="center"/>
+          </w:tcPr>
+          <w:p>
+            <w:pPr>
+              <w:jc w:val="center"/>
+              <w:rPr>
+                <w:sz w:val="16"/>
+                <w:szCs w:val="16"/>
+              </w:rPr>
+            </w:pPr>
+            <w:r>
+              <w:rPr>
+                <w:sz w:val="16"/>
+                <w:szCs w:val="16"/>
+              </w:rPr>
+              <w:t>70.04</w:t>
+            </w:r>
+          </w:p>
+        </w:tc>
+      </w:tr>
+    </w:tbl>
+    <w:p>
+      <w:pPr>
+        <w:jc w:val="both"/>
+      </w:pPr>
+    </w:p>
+    <w:p>
+      <w:pPr>
+        <w:ind w:firstLine="202"/>
+        <w:jc w:val="both"/>
+      </w:pPr>
+      <w:r>
+        <w:t>Table I</w:t>
+      </w:r>
+      <w:r>
+        <w:t>I</w:t>
+      </w:r>
+      <w:r>
+        <w:t xml:space="preserve"> shows the </w:t>
+      </w:r>
+      <w:proofErr w:type="gramStart"/>
+      <w:r>
+        <w:t>mean</w:t>
+      </w:r>
+      <w:proofErr w:type="gramEnd"/>
+      <w:r>
+        <w:t xml:space="preserve">, standard deviation, </w:t>
+      </w:r>
+      <w:r>
+        <w:rPr>
+          <w:color w:val="EE0000"/>
+        </w:rPr>
+        <w:t>and root mean square</w:t>
+      </w:r>
+      <w:r>
+        <w:rPr>
+          <w:color w:val="EE0000"/>
+        </w:rPr>
+        <w:t xml:space="preserve"> </w:t>
+      </w:r>
+      <w:r>
+        <w:rPr>
+          <w:color w:val="000000" w:themeColor="text1"/>
+        </w:rPr>
+        <w:t xml:space="preserve">of the </w:t>
+      </w:r>
+      <w:r>
+        <w:rPr>
+          <w:color w:val="000000" w:themeColor="text1"/>
+        </w:rPr>
+        <w:t xml:space="preserve">error </w:t>
+      </w:r>
+      <w:r>
+        <w:rPr>
+          <w:color w:val="000000" w:themeColor="text1"/>
+        </w:rPr>
+        <w:t>signal for the sinusoidal bang-bang trials.</w:t>
+      </w:r>
+    </w:p>
+    <w:p>
+      <w:pPr>
+        <w:pStyle w:val="TableTitle"/>
+      </w:pPr>
+      <w:r>
+        <w:t>TABLE I</w:t>
+      </w:r>
+      <w:r>
+        <w:t>I</w:t>
+      </w:r>
+    </w:p>
+    <w:p>
+      <w:pPr>
+        <w:pStyle w:val="TableTitle"/>
+      </w:pPr>
+      <w:r>
+        <w:t xml:space="preserve">Bang-Bang Sinusoidal </w:t>
+      </w:r>
+      <w:r>
+        <w:t>Error</w:t>
+      </w:r>
+      <w:r>
+        <w:t xml:space="preserve"> Signal Statistics</w:t>
+      </w:r>
+    </w:p>
+    <w:tbl>
+      <w:tblPr>
+        <w:tblW w:w="5040" w:type="dxa"/>
+        <w:tblInd w:w="90" w:type="dxa"/>
+        <w:tblBorders>
+          <w:top w:val="single" w:sz="12" w:space="0" w:color="808080"/>
+          <w:bottom w:val="single" w:sz="12" w:space="0" w:color="808080"/>
+        </w:tblBorders>
+        <w:tblLayout w:type="fixed"/>
+        <w:tblLook w:val="0000" w:firstRow="0" w:lastRow="0" w:firstColumn="0" w:lastColumn="0" w:noHBand="0" w:noVBand="0"/>
+      </w:tblPr>
+      <w:tblGrid>
+        <w:gridCol w:w="900"/>
+        <w:gridCol w:w="1080"/>
+        <w:gridCol w:w="810"/>
+        <w:gridCol w:w="1170"/>
+        <w:gridCol w:w="1080"/>
+      </w:tblGrid>
+      <w:tr>
+        <w:trPr>
+          <w:trHeight w:val="440"/>
+        </w:trPr>
+        <w:tc>
+          <w:tcPr>
+            <w:tcW w:w="900" w:type="dxa"/>
+            <w:tcBorders>
+              <w:top w:val="double" w:sz="6" w:space="0" w:color="auto"/>
+              <w:left w:val="nil"/>
+              <w:bottom w:val="single" w:sz="6" w:space="0" w:color="auto"/>
+              <w:right w:val="nil"/>
+            </w:tcBorders>
+            <w:vAlign w:val="center"/>
+          </w:tcPr>
+          <w:p>
+            <w:pPr>
+              <w:jc w:val="center"/>
+              <w:rPr>
+                <w:sz w:val="16"/>
+                <w:szCs w:val="16"/>
+              </w:rPr>
+            </w:pPr>
+            <w:r>
+              <w:rPr>
+                <w:sz w:val="16"/>
+                <w:szCs w:val="16"/>
+              </w:rPr>
+              <w:t>Deadband</w:t>
+            </w:r>
+          </w:p>
+        </w:tc>
+        <w:tc>
+          <w:tcPr>
+            <w:tcW w:w="1080" w:type="dxa"/>
+            <w:tcBorders>
+              <w:top w:val="double" w:sz="6" w:space="0" w:color="auto"/>
+              <w:left w:val="nil"/>
+              <w:bottom w:val="single" w:sz="6" w:space="0" w:color="auto"/>
+              <w:right w:val="nil"/>
+            </w:tcBorders>
+            <w:vAlign w:val="center"/>
+          </w:tcPr>
+          <w:p>
+            <w:pPr>
+              <w:pStyle w:val="TableTitle"/>
+              <w:rPr>
+                <w:smallCaps w:val="0"/>
+              </w:rPr>
+            </w:pPr>
+            <w:r>
+              <w:rPr>
+                <w:smallCaps w:val="0"/>
+              </w:rPr>
+              <w:t>Duty Cycle</w:t>
+            </w:r>
+          </w:p>
+        </w:tc>
+        <w:tc>
+          <w:tcPr>
+            <w:tcW w:w="810" w:type="dxa"/>
+            <w:tcBorders>
+              <w:top w:val="double" w:sz="4" w:space="0" w:color="auto"/>
+              <w:bottom w:val="single" w:sz="4" w:space="0" w:color="auto"/>
+            </w:tcBorders>
+            <w:vAlign w:val="center"/>
+          </w:tcPr>
+          <w:p>
+            <w:pPr>
+              <w:jc w:val="center"/>
+              <w:rPr>
+                <w:sz w:val="16"/>
+                <w:szCs w:val="16"/>
+              </w:rPr>
+            </w:pPr>
+            <w:r>
+              <w:rPr>
+                <w:sz w:val="16"/>
+                <w:szCs w:val="16"/>
+              </w:rPr>
+              <w:t>Mean</w:t>
+            </w:r>
+          </w:p>
+        </w:tc>
+        <w:tc>
+          <w:tcPr>
+            <w:tcW w:w="1170" w:type="dxa"/>
+            <w:tcBorders>
+              <w:top w:val="double" w:sz="6" w:space="0" w:color="auto"/>
+              <w:left w:val="nil"/>
+              <w:bottom w:val="single" w:sz="6" w:space="0" w:color="auto"/>
+              <w:right w:val="nil"/>
+            </w:tcBorders>
+            <w:vAlign w:val="center"/>
+          </w:tcPr>
+          <w:p>
+            <w:pPr>
+              <w:jc w:val="center"/>
+              <w:rPr>
+                <w:sz w:val="16"/>
+                <w:szCs w:val="16"/>
+              </w:rPr>
+            </w:pPr>
+            <w:r>
+              <w:rPr>
+                <w:sz w:val="16"/>
+                <w:szCs w:val="16"/>
+              </w:rPr>
+              <w:t>Standard Deviation</w:t>
+            </w:r>
+          </w:p>
+        </w:tc>
+        <w:tc>
+          <w:tcPr>
+            <w:tcW w:w="1080" w:type="dxa"/>
+            <w:tcBorders>
+              <w:top w:val="double" w:sz="4" w:space="0" w:color="auto"/>
+              <w:bottom w:val="single" w:sz="4" w:space="0" w:color="auto"/>
+            </w:tcBorders>
+            <w:vAlign w:val="center"/>
+          </w:tcPr>
+          <w:p>
+            <w:pPr>
+              <w:jc w:val="center"/>
+              <w:rPr>
+                <w:sz w:val="16"/>
+                <w:szCs w:val="16"/>
+              </w:rPr>
+            </w:pPr>
+            <w:r>
+              <w:rPr>
+                <w:sz w:val="16"/>
+                <w:szCs w:val="16"/>
+              </w:rPr>
+              <w:t>RMS</w:t>
+            </w:r>
+          </w:p>
+        </w:tc>
+      </w:tr>
+      <w:tr>
+        <w:tc>
+          <w:tcPr>
+            <w:tcW w:w="900" w:type="dxa"/>
+            <w:tcBorders>
+              <w:top w:val="nil"/>
+              <w:left w:val="nil"/>
+              <w:bottom w:val="nil"/>
+              <w:right w:val="nil"/>
+            </w:tcBorders>
+            <w:vAlign w:val="center"/>
+          </w:tcPr>
+          <w:p>
+            <w:pPr>
+              <w:jc w:val="center"/>
+              <w:rPr>
+                <w:sz w:val="16"/>
+                <w:szCs w:val="16"/>
+              </w:rPr>
+            </w:pPr>
+            <w:r>
+              <w:rPr>
+                <w:sz w:val="16"/>
+                <w:szCs w:val="16"/>
+              </w:rPr>
+              <w:t>0</w:t>
+            </w:r>
+          </w:p>
+        </w:tc>
+        <w:tc>
+          <w:tcPr>
+            <w:tcW w:w="1080" w:type="dxa"/>
+            <w:tcBorders>
+              <w:top w:val="nil"/>
+              <w:left w:val="nil"/>
+              <w:bottom w:val="nil"/>
+              <w:right w:val="nil"/>
+            </w:tcBorders>
+            <w:vAlign w:val="center"/>
+          </w:tcPr>
+          <w:p>
+            <w:pPr>
+              <w:jc w:val="center"/>
+              <w:rPr>
+                <w:sz w:val="16"/>
+                <w:szCs w:val="16"/>
+              </w:rPr>
+            </w:pPr>
+            <w:r>
+              <w:rPr>
+                <w:sz w:val="16"/>
+                <w:szCs w:val="16"/>
+              </w:rPr>
+              <w:t>0.5</w:t>
+            </w:r>
+          </w:p>
+        </w:tc>
+        <w:tc>
+          <w:tcPr>
+            <w:tcW w:w="810" w:type="dxa"/>
+            <w:tcBorders>
+              <w:top w:val="single" w:sz="4" w:space="0" w:color="auto"/>
+            </w:tcBorders>
+          </w:tcPr>
+          <w:p>
+            <w:pPr>
+              <w:jc w:val="center"/>
+              <w:rPr>
+                <w:sz w:val="16"/>
+                <w:szCs w:val="16"/>
+              </w:rPr>
+            </w:pPr>
+            <w:r>
+              <w:rPr>
+                <w:sz w:val="16"/>
+                <w:szCs w:val="16"/>
+              </w:rPr>
+              <w:t>0.2941</w:t>
+            </w:r>
+          </w:p>
+        </w:tc>
+        <w:tc>
+          <w:tcPr>
+            <w:tcW w:w="1170" w:type="dxa"/>
+            <w:tcBorders>
+              <w:top w:val="nil"/>
+              <w:left w:val="nil"/>
+              <w:bottom w:val="nil"/>
+              <w:right w:val="nil"/>
+            </w:tcBorders>
+          </w:tcPr>
+          <w:p>
+            <w:pPr>
+              <w:jc w:val="center"/>
+              <w:rPr>
+                <w:sz w:val="16"/>
+                <w:szCs w:val="16"/>
+              </w:rPr>
+            </w:pPr>
+            <w:r>
+              <w:rPr>
+                <w:sz w:val="16"/>
+                <w:szCs w:val="16"/>
+              </w:rPr>
+              <w:t>6.4424</w:t>
+            </w:r>
+          </w:p>
+        </w:tc>
+        <w:tc>
+          <w:tcPr>
+            <w:tcW w:w="1080" w:type="dxa"/>
+            <w:tcBorders>
+              <w:top w:val="single" w:sz="4" w:space="0" w:color="auto"/>
+            </w:tcBorders>
+          </w:tcPr>
+          <w:p>
+            <w:pPr>
+              <w:jc w:val="center"/>
+              <w:rPr>
+                <w:sz w:val="16"/>
+                <w:szCs w:val="16"/>
+              </w:rPr>
+            </w:pPr>
+            <w:r>
+              <w:rPr>
+                <w:sz w:val="16"/>
+                <w:szCs w:val="16"/>
+              </w:rPr>
+              <w:t>6.4483</w:t>
+            </w:r>
+          </w:p>
+        </w:tc>
+      </w:tr>
+      <w:tr>
+        <w:tc>
+          <w:tcPr>
+            <w:tcW w:w="900" w:type="dxa"/>
+            <w:tcBorders>
+              <w:top w:val="nil"/>
+              <w:left w:val="nil"/>
+              <w:bottom w:val="nil"/>
+              <w:right w:val="nil"/>
+            </w:tcBorders>
+            <w:vAlign w:val="center"/>
+          </w:tcPr>
+          <w:p>
+            <w:pPr>
+              <w:jc w:val="center"/>
+              <w:rPr>
+                <w:i/>
+                <w:iCs/>
+                <w:sz w:val="16"/>
+                <w:szCs w:val="16"/>
+              </w:rPr>
+            </w:pPr>
+            <w:r>
+              <w:rPr>
+                <w:i/>
+                <w:iCs/>
+                <w:sz w:val="16"/>
+                <w:szCs w:val="16"/>
+              </w:rPr>
+              <w:t>5</w:t>
+            </w:r>
+          </w:p>
+        </w:tc>
+        <w:tc>
+          <w:tcPr>
+            <w:tcW w:w="1080" w:type="dxa"/>
+            <w:tcBorders>
+              <w:top w:val="nil"/>
+              <w:left w:val="nil"/>
+              <w:bottom w:val="nil"/>
+              <w:right w:val="nil"/>
+            </w:tcBorders>
+            <w:vAlign w:val="center"/>
+          </w:tcPr>
+          <w:p>
+            <w:pPr>
+              <w:jc w:val="center"/>
+              <w:rPr>
+                <w:sz w:val="16"/>
+                <w:szCs w:val="16"/>
+              </w:rPr>
+            </w:pPr>
+            <w:r>
+              <w:rPr>
+                <w:sz w:val="16"/>
+                <w:szCs w:val="16"/>
+              </w:rPr>
+              <w:t>0.5</w:t>
+            </w:r>
+          </w:p>
+        </w:tc>
+        <w:tc>
+          <w:tcPr>
+            <w:tcW w:w="810" w:type="dxa"/>
+          </w:tcPr>
+          <w:p>
+            <w:pPr>
+              <w:jc w:val="center"/>
+              <w:rPr>
+                <w:sz w:val="16"/>
+                <w:szCs w:val="16"/>
+              </w:rPr>
+            </w:pPr>
+            <w:r>
+              <w:rPr>
+                <w:sz w:val="16"/>
+                <w:szCs w:val="16"/>
+              </w:rPr>
+              <w:t>-0.0864</w:t>
+            </w:r>
+          </w:p>
+        </w:tc>
+        <w:tc>
+          <w:tcPr>
+            <w:tcW w:w="1170" w:type="dxa"/>
+            <w:tcBorders>
+              <w:top w:val="nil"/>
+              <w:left w:val="nil"/>
+              <w:bottom w:val="nil"/>
+              <w:right w:val="nil"/>
+            </w:tcBorders>
+          </w:tcPr>
+          <w:p>
+            <w:pPr>
+              <w:jc w:val="center"/>
+              <w:rPr>
+                <w:sz w:val="16"/>
+                <w:szCs w:val="16"/>
+                <w:vertAlign w:val="superscript"/>
+              </w:rPr>
+            </w:pPr>
+            <w:r>
+              <w:rPr>
+                <w:sz w:val="16"/>
+                <w:szCs w:val="16"/>
+              </w:rPr>
+              <w:t>3.8029</w:t>
+            </w:r>
+          </w:p>
+        </w:tc>
+        <w:tc>
+          <w:tcPr>
+            <w:tcW w:w="1080" w:type="dxa"/>
+          </w:tcPr>
+          <w:p>
+            <w:pPr>
+              <w:jc w:val="center"/>
+              <w:rPr>
+                <w:sz w:val="16"/>
+                <w:szCs w:val="16"/>
+              </w:rPr>
+            </w:pPr>
+            <w:r>
+              <w:rPr>
+                <w:sz w:val="16"/>
+                <w:szCs w:val="16"/>
+              </w:rPr>
+              <w:t>3.8034</w:t>
+            </w:r>
+          </w:p>
+        </w:tc>
+      </w:tr>
+      <w:tr>
+        <w:tc>
+          <w:tcPr>
+            <w:tcW w:w="900" w:type="dxa"/>
+            <w:tcBorders>
+              <w:top w:val="nil"/>
+              <w:left w:val="nil"/>
+              <w:bottom w:val="nil"/>
+              <w:right w:val="nil"/>
+            </w:tcBorders>
+            <w:vAlign w:val="center"/>
+          </w:tcPr>
+          <w:p>
+            <w:pPr>
+              <w:jc w:val="center"/>
+              <w:rPr>
+                <w:i/>
+                <w:iCs/>
+                <w:sz w:val="16"/>
+                <w:szCs w:val="16"/>
+              </w:rPr>
+            </w:pPr>
+            <w:r>
+              <w:rPr>
+                <w:i/>
+                <w:iCs/>
+                <w:sz w:val="16"/>
+                <w:szCs w:val="16"/>
+              </w:rPr>
+              <w:t>10</w:t>
+            </w:r>
+          </w:p>
+        </w:tc>
+        <w:tc>
+          <w:tcPr>
+            <w:tcW w:w="1080" w:type="dxa"/>
+            <w:tcBorders>
+              <w:top w:val="nil"/>
+              <w:left w:val="nil"/>
+              <w:bottom w:val="nil"/>
+              <w:right w:val="nil"/>
+            </w:tcBorders>
+            <w:vAlign w:val="center"/>
+          </w:tcPr>
+          <w:p>
+            <w:pPr>
+              <w:jc w:val="center"/>
+              <w:rPr>
+                <w:sz w:val="16"/>
+                <w:szCs w:val="16"/>
+              </w:rPr>
+            </w:pPr>
+            <w:r>
+              <w:rPr>
+                <w:sz w:val="16"/>
+                <w:szCs w:val="16"/>
+              </w:rPr>
+              <w:t>0.5</w:t>
+            </w:r>
+          </w:p>
+        </w:tc>
+        <w:tc>
+          <w:tcPr>
+            <w:tcW w:w="810" w:type="dxa"/>
+          </w:tcPr>
+          <w:p>
+            <w:pPr>
+              <w:jc w:val="center"/>
+              <w:rPr>
+                <w:sz w:val="16"/>
+                <w:szCs w:val="16"/>
+              </w:rPr>
+            </w:pPr>
+            <w:r>
+              <w:rPr>
+                <w:sz w:val="16"/>
+                <w:szCs w:val="16"/>
+              </w:rPr>
+              <w:t>1.5063</w:t>
+            </w:r>
+          </w:p>
+        </w:tc>
+        <w:tc>
+          <w:tcPr>
+            <w:tcW w:w="1170" w:type="dxa"/>
+            <w:tcBorders>
+              <w:top w:val="nil"/>
+              <w:left w:val="nil"/>
+              <w:bottom w:val="nil"/>
+              <w:right w:val="nil"/>
+            </w:tcBorders>
+          </w:tcPr>
+          <w:p>
+            <w:pPr>
+              <w:jc w:val="center"/>
+              <w:rPr>
+                <w:sz w:val="16"/>
+                <w:szCs w:val="16"/>
+              </w:rPr>
+            </w:pPr>
+            <w:r>
+              <w:rPr>
+                <w:sz w:val="16"/>
+                <w:szCs w:val="16"/>
+              </w:rPr>
+              <w:t>7.7224</w:t>
+            </w:r>
+          </w:p>
+        </w:tc>
+        <w:tc>
+          <w:tcPr>
+            <w:tcW w:w="1080" w:type="dxa"/>
+          </w:tcPr>
+          <w:p>
+            <w:pPr>
+              <w:jc w:val="center"/>
+              <w:rPr>
+                <w:sz w:val="16"/>
+                <w:szCs w:val="16"/>
+              </w:rPr>
+            </w:pPr>
+            <w:r>
+              <w:rPr>
+                <w:sz w:val="16"/>
+                <w:szCs w:val="16"/>
+              </w:rPr>
+              <w:t>7.8670</w:t>
+            </w:r>
+          </w:p>
+        </w:tc>
+      </w:tr>
+      <w:tr>
+        <w:tc>
+          <w:tcPr>
+            <w:tcW w:w="900" w:type="dxa"/>
+            <w:tcBorders>
+              <w:top w:val="nil"/>
+              <w:left w:val="nil"/>
+              <w:bottom w:val="nil"/>
+              <w:right w:val="nil"/>
+            </w:tcBorders>
+            <w:vAlign w:val="center"/>
+          </w:tcPr>
+          <w:p>
+            <w:pPr>
+              <w:jc w:val="center"/>
+              <w:rPr>
+                <w:i/>
+                <w:iCs/>
+                <w:sz w:val="16"/>
+                <w:szCs w:val="16"/>
+              </w:rPr>
+            </w:pPr>
+            <w:r>
+              <w:rPr>
+                <w:sz w:val="16"/>
+                <w:szCs w:val="16"/>
+              </w:rPr>
+              <w:t>0</w:t>
+            </w:r>
+          </w:p>
+        </w:tc>
+        <w:tc>
+          <w:tcPr>
+            <w:tcW w:w="1080" w:type="dxa"/>
+            <w:tcBorders>
+              <w:top w:val="nil"/>
+              <w:left w:val="nil"/>
+              <w:bottom w:val="nil"/>
+              <w:right w:val="nil"/>
+            </w:tcBorders>
+            <w:vAlign w:val="center"/>
+          </w:tcPr>
+          <w:p>
+            <w:pPr>
+              <w:jc w:val="center"/>
+              <w:rPr>
+                <w:sz w:val="16"/>
+                <w:szCs w:val="16"/>
+                <w:vertAlign w:val="superscript"/>
+              </w:rPr>
+            </w:pPr>
+            <w:r>
+              <w:rPr>
+                <w:sz w:val="16"/>
+                <w:szCs w:val="16"/>
+              </w:rPr>
+              <w:t>1.0</w:t>
+            </w:r>
+          </w:p>
+        </w:tc>
+        <w:tc>
+          <w:tcPr>
+            <w:tcW w:w="810" w:type="dxa"/>
+          </w:tcPr>
+          <w:p>
+            <w:pPr>
+              <w:jc w:val="center"/>
+              <w:rPr>
+                <w:sz w:val="16"/>
+                <w:szCs w:val="16"/>
+              </w:rPr>
+            </w:pPr>
+            <w:r>
+              <w:rPr>
+                <w:sz w:val="16"/>
+                <w:szCs w:val="16"/>
+              </w:rPr>
+              <w:t>0.4531</w:t>
+            </w:r>
+          </w:p>
+        </w:tc>
+        <w:tc>
+          <w:tcPr>
+            <w:tcW w:w="1170" w:type="dxa"/>
+            <w:tcBorders>
+              <w:top w:val="nil"/>
+              <w:left w:val="nil"/>
+              <w:bottom w:val="nil"/>
+              <w:right w:val="nil"/>
+            </w:tcBorders>
+          </w:tcPr>
+          <w:p>
+            <w:pPr>
+              <w:jc w:val="center"/>
+              <w:rPr>
+                <w:sz w:val="16"/>
+                <w:szCs w:val="16"/>
+              </w:rPr>
+            </w:pPr>
+            <w:r>
+              <w:rPr>
+                <w:sz w:val="16"/>
+                <w:szCs w:val="16"/>
+              </w:rPr>
+              <w:t>14.749</w:t>
+            </w:r>
+          </w:p>
+        </w:tc>
+        <w:tc>
+          <w:tcPr>
+            <w:tcW w:w="1080" w:type="dxa"/>
+          </w:tcPr>
+          <w:p>
+            <w:pPr>
+              <w:jc w:val="center"/>
+              <w:rPr>
+                <w:sz w:val="16"/>
+                <w:szCs w:val="16"/>
+              </w:rPr>
+            </w:pPr>
+            <w:r>
+              <w:rPr>
+                <w:sz w:val="16"/>
+                <w:szCs w:val="16"/>
+              </w:rPr>
+              <w:t>14.754</w:t>
+            </w:r>
+          </w:p>
+        </w:tc>
+      </w:tr>
+      <w:tr>
+        <w:trPr>
+          <w:trHeight w:val="81"/>
+        </w:trPr>
+        <w:tc>
+          <w:tcPr>
+            <w:tcW w:w="900" w:type="dxa"/>
+            <w:tcBorders>
+              <w:top w:val="nil"/>
+              <w:left w:val="nil"/>
+              <w:bottom w:val="nil"/>
+              <w:right w:val="nil"/>
+            </w:tcBorders>
+            <w:vAlign w:val="center"/>
+          </w:tcPr>
+          <w:p>
+            <w:pPr>
+              <w:jc w:val="center"/>
+              <w:rPr>
+                <w:i/>
+                <w:iCs/>
+                <w:sz w:val="16"/>
+                <w:szCs w:val="16"/>
+              </w:rPr>
+            </w:pPr>
+            <w:r>
+              <w:rPr>
+                <w:i/>
+                <w:iCs/>
+                <w:sz w:val="16"/>
+                <w:szCs w:val="16"/>
+              </w:rPr>
+              <w:t>5</w:t>
+            </w:r>
+          </w:p>
+        </w:tc>
+        <w:tc>
+          <w:tcPr>
+            <w:tcW w:w="1080" w:type="dxa"/>
+            <w:tcBorders>
+              <w:top w:val="nil"/>
+              <w:left w:val="nil"/>
+              <w:bottom w:val="nil"/>
+              <w:right w:val="nil"/>
+            </w:tcBorders>
+            <w:vAlign w:val="center"/>
+          </w:tcPr>
+          <w:p>
+            <w:pPr>
+              <w:jc w:val="center"/>
+              <w:rPr>
+                <w:sz w:val="16"/>
+                <w:szCs w:val="16"/>
+              </w:rPr>
+            </w:pPr>
+            <w:r>
+              <w:rPr>
+                <w:sz w:val="16"/>
+                <w:szCs w:val="16"/>
+              </w:rPr>
+              <w:t>1.0</w:t>
+            </w:r>
+          </w:p>
+        </w:tc>
+        <w:tc>
+          <w:tcPr>
+            <w:tcW w:w="810" w:type="dxa"/>
+          </w:tcPr>
+          <w:p>
+            <w:pPr>
+              <w:jc w:val="center"/>
+              <w:rPr>
+                <w:sz w:val="16"/>
+                <w:szCs w:val="16"/>
+              </w:rPr>
+            </w:pPr>
+            <w:r>
+              <w:rPr>
+                <w:sz w:val="16"/>
+                <w:szCs w:val="16"/>
+              </w:rPr>
+              <w:t>0.6585</w:t>
+            </w:r>
+          </w:p>
+        </w:tc>
+        <w:tc>
+          <w:tcPr>
+            <w:tcW w:w="1170" w:type="dxa"/>
+            <w:tcBorders>
+              <w:top w:val="nil"/>
+              <w:left w:val="nil"/>
+              <w:bottom w:val="nil"/>
+              <w:right w:val="nil"/>
+            </w:tcBorders>
+          </w:tcPr>
+          <w:p>
+            <w:pPr>
+              <w:jc w:val="center"/>
+              <w:rPr>
+                <w:sz w:val="16"/>
+                <w:szCs w:val="16"/>
+              </w:rPr>
+            </w:pPr>
+            <w:r>
+              <w:rPr>
+                <w:sz w:val="16"/>
+                <w:szCs w:val="16"/>
+              </w:rPr>
+              <w:t>12.079</w:t>
+            </w:r>
+          </w:p>
+        </w:tc>
+        <w:tc>
+          <w:tcPr>
+            <w:tcW w:w="1080" w:type="dxa"/>
+          </w:tcPr>
+          <w:p>
+            <w:pPr>
+              <w:jc w:val="center"/>
+              <w:rPr>
+                <w:sz w:val="16"/>
+                <w:szCs w:val="16"/>
+              </w:rPr>
+            </w:pPr>
+            <w:r>
+              <w:rPr>
+                <w:sz w:val="16"/>
+                <w:szCs w:val="16"/>
+              </w:rPr>
+              <w:t>12.096</w:t>
+            </w:r>
+          </w:p>
+        </w:tc>
+      </w:tr>
+      <w:tr>
+        <w:trPr>
+          <w:trHeight w:val="162"/>
+        </w:trPr>
+        <w:tc>
+          <w:tcPr>
+            <w:tcW w:w="900" w:type="dxa"/>
+            <w:tcBorders>
+              <w:top w:val="nil"/>
+              <w:left w:val="nil"/>
+              <w:bottom w:val="double" w:sz="6" w:space="0" w:color="auto"/>
+              <w:right w:val="nil"/>
+            </w:tcBorders>
+            <w:vAlign w:val="center"/>
+          </w:tcPr>
+          <w:p>
+            <w:pPr>
+              <w:jc w:val="center"/>
+              <w:rPr>
+                <w:i/>
+                <w:iCs/>
+                <w:sz w:val="16"/>
+                <w:szCs w:val="16"/>
+              </w:rPr>
+            </w:pPr>
+            <w:r>
+              <w:rPr>
+                <w:i/>
+                <w:iCs/>
+                <w:sz w:val="16"/>
+                <w:szCs w:val="16"/>
+              </w:rPr>
+              <w:t>10</w:t>
+            </w:r>
+          </w:p>
+        </w:tc>
+        <w:tc>
+          <w:tcPr>
+            <w:tcW w:w="1080" w:type="dxa"/>
+            <w:tcBorders>
+              <w:top w:val="nil"/>
+              <w:left w:val="nil"/>
+              <w:bottom w:val="double" w:sz="6" w:space="0" w:color="auto"/>
+              <w:right w:val="nil"/>
+            </w:tcBorders>
+            <w:vAlign w:val="center"/>
+          </w:tcPr>
+          <w:p>
+            <w:pPr>
+              <w:jc w:val="center"/>
+              <w:rPr>
+                <w:sz w:val="16"/>
+                <w:szCs w:val="16"/>
+              </w:rPr>
+            </w:pPr>
+            <w:r>
+              <w:rPr>
+                <w:sz w:val="16"/>
+                <w:szCs w:val="16"/>
+              </w:rPr>
+              <w:t>1.0</w:t>
+            </w:r>
+          </w:p>
+        </w:tc>
+        <w:tc>
+          <w:tcPr>
+            <w:tcW w:w="810" w:type="dxa"/>
+            <w:tcBorders>
+              <w:bottom w:val="double" w:sz="4" w:space="0" w:color="auto"/>
+            </w:tcBorders>
+          </w:tcPr>
+          <w:p>
+            <w:pPr>
+              <w:jc w:val="center"/>
+              <w:rPr>
+                <w:sz w:val="16"/>
+                <w:szCs w:val="16"/>
+              </w:rPr>
+            </w:pPr>
+            <w:r>
+              <w:rPr>
+                <w:sz w:val="16"/>
+                <w:szCs w:val="16"/>
+              </w:rPr>
+              <w:t>0.1468</w:t>
+            </w:r>
+          </w:p>
+        </w:tc>
+        <w:tc>
+          <w:tcPr>
+            <w:tcW w:w="1170" w:type="dxa"/>
+            <w:tcBorders>
+              <w:top w:val="nil"/>
+              <w:left w:val="nil"/>
+              <w:bottom w:val="double" w:sz="6" w:space="0" w:color="auto"/>
+              <w:right w:val="nil"/>
+            </w:tcBorders>
+          </w:tcPr>
+          <w:p>
+            <w:pPr>
+              <w:jc w:val="center"/>
+              <w:rPr>
+                <w:sz w:val="16"/>
+                <w:szCs w:val="16"/>
+              </w:rPr>
+            </w:pPr>
+            <w:r>
+              <w:rPr>
+                <w:sz w:val="16"/>
+                <w:szCs w:val="16"/>
+              </w:rPr>
+              <w:t>5.8111</w:t>
+            </w:r>
+          </w:p>
+        </w:tc>
+        <w:tc>
+          <w:tcPr>
+            <w:tcW w:w="1080" w:type="dxa"/>
+            <w:tcBorders>
+              <w:bottom w:val="double" w:sz="4" w:space="0" w:color="auto"/>
+            </w:tcBorders>
+          </w:tcPr>
+          <w:p>
+            <w:pPr>
+              <w:jc w:val="center"/>
+              <w:rPr>
+                <w:sz w:val="16"/>
+                <w:szCs w:val="16"/>
+              </w:rPr>
+            </w:pPr>
+            <w:r>
+              <w:rPr>
+                <w:sz w:val="16"/>
+                <w:szCs w:val="16"/>
+              </w:rPr>
+              <w:t>5.8122</w:t>
+            </w:r>
+          </w:p>
+        </w:tc>
+      </w:tr>
+    </w:tbl>
+    <w:p>
+      <w:pPr>
+        <w:jc w:val="both"/>
+      </w:pPr>
+    </w:p>
+    <w:p>
+      <w:pPr>
+        <w:rPr>
+          <w:color w:val="000000" w:themeColor="text1"/>
+        </w:rPr>
+      </w:pPr>
+    </w:p>
+    <w:p>
+      <w:pPr>
+        <w:rPr>
+          <w:i/>
+          <w:iCs/>
+        </w:rPr>
+      </w:pPr>
+    </w:p>
+    <w:p>
+      <w:pPr>
+        <w:rPr>
+          <w:i/>
+          <w:iCs/>
+        </w:rPr>
+      </w:pPr>
+      <w:r>
+        <w:rPr>
+          <w:i/>
+          <w:iCs/>
+        </w:rPr>
+        <w:t>Step Response</w:t>
+      </w:r>
+    </w:p>
+    <w:p>
+      <w:pPr>
+        <w:jc w:val="both"/>
+      </w:pPr>
+      <w:r>
+        <w:rPr>
+          <w:i/>
+          <w:iCs/>
+        </w:rPr>
+        <w:lastRenderedPageBreak/>
         <w:tab/>
       </w:r>
       <w:r>
@@ -4930,7 +7299,6 @@
                 <w:sz w:val="16"/>
                 <w:szCs w:val="16"/>
               </w:rPr>
-              <w:lastRenderedPageBreak/>
               <w:t>5</w:t>
             </w:r>
           </w:p>
@@ -5296,7 +7664,21 @@
         <w:rPr>
           <w:color w:val="000000" w:themeColor="text1"/>
         </w:rPr>
-        <w:t>and phase of the input and outputs were calculated and used to find the DC gain and the time constant shown in Table III.</w:t>
+        <w:t xml:space="preserve">and </w:t>
+      </w:r>
+      <w:proofErr w:type="gramStart"/>
+      <w:r>
+        <w:rPr>
+          <w:color w:val="000000" w:themeColor="text1"/>
+        </w:rPr>
+        <w:t>phase</w:t>
+      </w:r>
+      <w:proofErr w:type="gramEnd"/>
+      <w:r>
+        <w:rPr>
+          <w:color w:val="000000" w:themeColor="text1"/>
+        </w:rPr>
+        <w:t xml:space="preserve"> of the input and outputs were calculated and used to find the DC gain and the time constant shown in Table III.</w:t>
       </w:r>
     </w:p>
     <w:p>
@@ -6255,14 +8637,7 @@
           <w:sz w:val="16"/>
           <w:szCs w:val="16"/>
         </w:rPr>
-        <w:t xml:space="preserve">the Bode Plot values generated from the frequency </w:t>
-      </w:r>
-      <w:r>
-        <w:rPr>
-          <w:sz w:val="16"/>
-          <w:szCs w:val="16"/>
-        </w:rPr>
-        <w:t>response as well as the model frequency responses from the Bode and Step fit.</w:t>
+        <w:t>the Bode Plot values generated from the frequency response as well as the model frequency responses from the Bode and Step fit.</w:t>
       </w:r>
     </w:p>
     <w:p>
@@ -6375,34 +8750,66 @@
           <w:i w:val="0"/>
           <w:iCs w:val="0"/>
         </w:rPr>
-        <w:t xml:space="preserve">order transfer function was generated using two methods. The first method was exciting the system at different frequencies to record the sinusoidal </w:t>
-      </w:r>
+        <w:t xml:space="preserve">order transfer function was generated using two methods. The first method was </w:t>
+      </w:r>
+      <w:proofErr w:type="gramStart"/>
       <w:r>
         <w:rPr>
           <w:i w:val="0"/>
           <w:iCs w:val="0"/>
         </w:rPr>
-        <w:t>response,</w:t>
-      </w:r>
+        <w:t>exciting</w:t>
+      </w:r>
+      <w:proofErr w:type="gramEnd"/>
       <w:r>
         <w:rPr>
           <w:i w:val="0"/>
           <w:iCs w:val="0"/>
         </w:rPr>
-        <w:t xml:space="preserve"> and the second method was providing a repeated step input to observe the systems long term response. </w:t>
+        <w:t xml:space="preserve"> the system at different frequencies to record the sinusoidal </w:t>
       </w:r>
       <w:r>
         <w:rPr>
           <w:i w:val="0"/>
           <w:iCs w:val="0"/>
         </w:rPr>
-        <w:t>Both</w:t>
+        <w:t>response,</w:t>
       </w:r>
       <w:r>
         <w:rPr>
           <w:i w:val="0"/>
           <w:iCs w:val="0"/>
         </w:rPr>
+        <w:t xml:space="preserve"> and the second method was providing a repeated step input to observe the </w:t>
+      </w:r>
+      <w:proofErr w:type="gramStart"/>
+      <w:r>
+        <w:rPr>
+          <w:i w:val="0"/>
+          <w:iCs w:val="0"/>
+        </w:rPr>
+        <w:t>systems</w:t>
+      </w:r>
+      <w:proofErr w:type="gramEnd"/>
+      <w:r>
+        <w:rPr>
+          <w:i w:val="0"/>
+          <w:iCs w:val="0"/>
+        </w:rPr>
+        <w:t xml:space="preserve"> long term response. </w:t>
+      </w:r>
+      <w:r>
+        <w:rPr>
+          <w:i w:val="0"/>
+          <w:iCs w:val="0"/>
+        </w:rPr>
+        <w:t>Both</w:t>
+      </w:r>
+      <w:r>
+        <w:rPr>
+          <w:i w:val="0"/>
+          <w:iCs w:val="0"/>
+        </w:rPr>
         <w:t xml:space="preserve"> methods provided a gain and time constant that could be used to create a transfer function to compare to the raw data.</w:t>
       </w:r>
     </w:p>
@@ -6549,7 +8956,6 @@
           <w:i/>
           <w:iCs/>
         </w:rPr>
-        <w:lastRenderedPageBreak/>
         <w:t>Future Improvement</w:t>
       </w:r>
     </w:p>
@@ -6574,7 +8980,15 @@
         <w:t xml:space="preserve">, the actual voltage could be measured instead of the command to </w:t>
       </w:r>
       <w:r>
-        <w:t xml:space="preserve">improve the input accuracy. The delay between the direction reversals could be factored into the measurements to delay data collection until the system is ready to respond. The step experiment could be conducted on multiple frequencies and amplitudes to confirm the same values of gain and time constant. The frequency experiment could also be performed on more amplitudes to reduce uncertainty in the gain and time constant. </w:t>
+        <w:t xml:space="preserve">improve the input accuracy. The delay between the direction reversals could be factored </w:t>
+      </w:r>
+      <w:proofErr w:type="gramStart"/>
+      <w:r>
+        <w:t>into the measurements</w:t>
+      </w:r>
+      <w:proofErr w:type="gramEnd"/>
+      <w:r>
+        <w:t xml:space="preserve"> to delay data collection until the system is ready to respond. The step experiment could be conducted on multiple frequencies and amplitudes to confirm the same values of gain and time constant. The frequency experiment could also be performed on more amplitudes to reduce uncertainty in the gain and time constant. </w:t>
       </w:r>
     </w:p>
     <w:p>
@@ -7719,7 +10133,7 @@
   <w:style w:type="paragraph" w:default="1" w:styleId="Normal">
     <w:name w:val="Normal"/>
     <w:qFormat/>
-    <w:rsid w:val="003F7A69"/>
+    <w:rsid w:val="00B766EB"/>
     <w:pPr>
       <w:autoSpaceDE w:val="0"/>
       <w:autoSpaceDN w:val="0"/>

</xml_diff>